<commit_message>
changed website name to student toolkit website
</commit_message>
<xml_diff>
--- a/day 4.docx
+++ b/day 4.docx
@@ -1,6 +1,6 @@
 
 <file path=word/document.xml><?xml version="1.0" encoding="utf-8"?>
-<w:document xmlns:wpc="http://schemas.microsoft.com/office/word/2010/wordprocessingCanvas" xmlns:cx="http://schemas.microsoft.com/office/drawing/2014/chartex" xmlns:cx1="http://schemas.microsoft.com/office/drawing/2015/9/8/chartex" xmlns:cx2="http://schemas.microsoft.com/office/drawing/2015/10/21/chartex" xmlns:cx3="http://schemas.microsoft.com/office/drawing/2016/5/9/chartex" xmlns:cx4="http://schemas.microsoft.com/office/drawing/2016/5/10/chartex" xmlns:cx5="http://schemas.microsoft.com/office/drawing/2016/5/11/chartex" xmlns:cx6="http://schemas.microsoft.com/office/drawing/2016/5/12/chartex" xmlns:cx7="http://schemas.microsoft.com/office/drawing/2016/5/13/chartex" xmlns:cx8="http://schemas.microsoft.com/office/drawing/2016/5/14/chartex" xmlns:mc="http://schemas.openxmlformats.org/markup-compatibility/2006" xmlns:aink="http://schemas.microsoft.com/office/drawing/2016/ink" xmlns:am3d="http://schemas.microsoft.com/office/drawing/2017/model3d" xmlns:o="urn:schemas-microsoft-com:office:office" xmlns:oel="http://schemas.microsoft.com/office/2019/extlst" xmlns:r="http://schemas.openxmlformats.org/officeDocument/2006/relationships" xmlns:m="http://schemas.openxmlformats.org/officeDocument/2006/math" xmlns:v="urn:schemas-microsoft-com:vml" xmlns:wp14="http://schemas.microsoft.com/office/word/2010/wordprocessingDrawing" xmlns:wp="http://schemas.openxmlformats.org/drawingml/2006/wordprocessingDrawing" xmlns:w10="urn:schemas-microsoft-com:office:word" xmlns:w="http://schemas.openxmlformats.org/wordprocessingml/2006/main" xmlns:w14="http://schemas.microsoft.com/office/word/2010/wordml" xmlns:w15="http://schemas.microsoft.com/office/word/2012/wordml" xmlns:w16cex="http://schemas.microsoft.com/office/word/2018/wordml/cex" xmlns:w16cid="http://schemas.microsoft.com/office/word/2016/wordml/cid" xmlns:w16="http://schemas.microsoft.com/office/word/2018/wordml" xmlns:w16du="http://schemas.microsoft.com/office/word/2023/wordml/word16du" xmlns:w16sdtdh="http://schemas.microsoft.com/office/word/2020/wordml/sdtdatahash" xmlns:w16sdtfl="http://schemas.microsoft.com/office/word/2024/wordml/sdtformatlock" xmlns:w16se="http://schemas.microsoft.com/office/word/2015/wordml/symex" xmlns:wpg="http://schemas.microsoft.com/office/word/2010/wordprocessingGroup" xmlns:wpi="http://schemas.microsoft.com/office/word/2010/wordprocessingInk" xmlns:wne="http://schemas.microsoft.com/office/word/2006/wordml" xmlns:wps="http://schemas.microsoft.com/office/word/2010/wordprocessingShape" mc:Ignorable="w14 w15 w16se w16cid w16 w16cex w16sdtdh w16sdtfl w16du wp14">
+<w:document xmlns:wpc="http://schemas.microsoft.com/office/word/2010/wordprocessingCanvas" xmlns:cx="http://schemas.microsoft.com/office/drawing/2014/chartex" xmlns:cx1="http://schemas.microsoft.com/office/drawing/2015/9/8/chartex" xmlns:cx2="http://schemas.microsoft.com/office/drawing/2015/10/21/chartex" xmlns:cx3="http://schemas.microsoft.com/office/drawing/2016/5/9/chartex" xmlns:cx4="http://schemas.microsoft.com/office/drawing/2016/5/10/chartex" xmlns:cx5="http://schemas.microsoft.com/office/drawing/2016/5/11/chartex" xmlns:cx6="http://schemas.microsoft.com/office/drawing/2016/5/12/chartex" xmlns:cx7="http://schemas.microsoft.com/office/drawing/2016/5/13/chartex" xmlns:cx8="http://schemas.microsoft.com/office/drawing/2016/5/14/chartex" xmlns:mc="http://schemas.openxmlformats.org/markup-compatibility/2006" xmlns:aink="http://schemas.microsoft.com/office/drawing/2016/ink" xmlns:am3d="http://schemas.microsoft.com/office/drawing/2017/model3d" xmlns:o="urn:schemas-microsoft-com:office:office" xmlns:oel="http://schemas.microsoft.com/office/2019/extlst" xmlns:r="http://schemas.openxmlformats.org/officeDocument/2006/relationships" xmlns:m="http://schemas.openxmlformats.org/officeDocument/2006/math" xmlns:v="urn:schemas-microsoft-com:vml" xmlns:wp14="http://schemas.microsoft.com/office/word/2010/wordprocessingDrawing" xmlns:wp="http://schemas.openxmlformats.org/drawingml/2006/wordprocessingDrawing" xmlns:w10="urn:schemas-microsoft-com:office:word" xmlns:w="http://schemas.openxmlformats.org/wordprocessingml/2006/main" xmlns:w14="http://schemas.microsoft.com/office/word/2010/wordml" xmlns:w15="http://schemas.microsoft.com/office/word/2012/wordml" xmlns:w16cex="http://schemas.microsoft.com/office/word/2018/wordml/cex" xmlns:w16cid="http://schemas.microsoft.com/office/word/2016/wordml/cid" xmlns:w16="http://schemas.microsoft.com/office/word/2018/wordml" xmlns:w16sdtdh="http://schemas.microsoft.com/office/word/2020/wordml/sdtdatahash" xmlns:w16se="http://schemas.microsoft.com/office/word/2015/wordml/symex" xmlns:wpg="http://schemas.microsoft.com/office/word/2010/wordprocessingGroup" xmlns:wpi="http://schemas.microsoft.com/office/word/2010/wordprocessingInk" xmlns:wne="http://schemas.microsoft.com/office/word/2006/wordml" xmlns:wps="http://schemas.microsoft.com/office/word/2010/wordprocessingShape" mc:Ignorable="w14 w15 w16se w16cid w16 w16cex w16sdtdh wp14">
   <w:body>
     <w:p>
       <w:pPr>
@@ -304,15 +304,7 @@
           <w:bCs/>
           <w:u w:val="single"/>
         </w:rPr>
-        <w:t>Sub group 0</w:t>
-      </w:r>
-      <w:r>
-        <w:rPr>
-          <w:b/>
-          <w:bCs/>
-          <w:u w:val="single"/>
-        </w:rPr>
-        <w:t>2</w:t>
+        <w:t>Sub group 02</w:t>
       </w:r>
     </w:p>
     <w:p>
@@ -320,13 +312,7 @@
         <w:t xml:space="preserve">1. </w:t>
       </w:r>
       <w:r>
-        <w:t xml:space="preserve">create the study timer which is linked to study timer button in the navigation bar of the main.html the study timer must </w:t>
-      </w:r>
-      <w:r>
-        <w:t>contain</w:t>
-      </w:r>
-      <w:r>
-        <w:t xml:space="preserve"> a 25minute timer count and there must be a start and reset button to the timer and after the timer goes off an alarm sound should be run to alert the user</w:t>
+        <w:t>create the study timer which is linked to study timer button in the navigation bar of the main.html the study timer must contain a 25minute timer count and there must be a start and reset button to the timer and after the timer goes off an alarm sound should be run to alert the user</w:t>
       </w:r>
     </w:p>
     <w:p>
@@ -336,13 +322,7 @@
     </w:p>
     <w:p>
       <w:r>
-        <w:t xml:space="preserve">3. when timer hits zero an alarm sound </w:t>
-      </w:r>
-      <w:r>
-        <w:t>should</w:t>
-      </w:r>
-      <w:r>
-        <w:t xml:space="preserve"> be played via speakers and also timer must be resets automatically</w:t>
+        <w:t>3. when timer hits zero an alarm sound should be played via speakers and also timer must be resets automatically</w:t>
       </w:r>
     </w:p>
     <w:p>
@@ -353,13 +333,7 @@
     <w:p>
       <w:r>
         <w:lastRenderedPageBreak/>
-        <w:t xml:space="preserve">5. fix the </w:t>
-      </w:r>
-      <w:r>
-        <w:t>drop-down</w:t>
-      </w:r>
-      <w:r>
-        <w:t xml:space="preserve"> icon indentation in select your name and make the cross a bit larger and set it to middle in idea remove section in idea board</w:t>
+        <w:t>5. fix the drop-down icon indentation in select your name and make the cross a bit larger and set it to middle in idea remove section in idea board</w:t>
       </w:r>
     </w:p>
     <w:p>
@@ -380,13 +354,7 @@
       </w:r>
       <w:proofErr w:type="spellEnd"/>
       <w:r>
-        <w:t xml:space="preserve"> connected to the button </w:t>
-      </w:r>
-      <w:r>
-        <w:t>check</w:t>
-      </w:r>
-      <w:r>
-        <w:t xml:space="preserve"> it</w:t>
+        <w:t xml:space="preserve"> connected to the button check it</w:t>
       </w:r>
     </w:p>
     <w:p>
@@ -525,49 +493,17 @@
           <w:bCs/>
           <w:u w:val="single"/>
         </w:rPr>
-        <w:t>Sub group 0</w:t>
-      </w:r>
-      <w:r>
-        <w:rPr>
-          <w:b/>
-          <w:bCs/>
-          <w:u w:val="single"/>
-        </w:rPr>
-        <w:t>3</w:t>
-      </w:r>
-    </w:p>
-    <w:p>
-      <w:r>
-        <w:t xml:space="preserve">Make the </w:t>
-      </w:r>
-      <w:r>
-        <w:t>GPA</w:t>
-      </w:r>
-      <w:r>
-        <w:t xml:space="preserve"> </w:t>
-      </w:r>
-      <w:r>
-        <w:t>calculator</w:t>
-      </w:r>
-      <w:r>
-        <w:t xml:space="preserve"> button functional by updating main.html, script.js and style.css, the user should be able to type the course credits, type grades after clicking the Calculate button the system should process and display overall GPA </w:t>
-      </w:r>
-    </w:p>
-    <w:p>
-      <w:r>
-        <w:t xml:space="preserve">in </w:t>
-      </w:r>
-      <w:r>
-        <w:t>GPA</w:t>
-      </w:r>
-      <w:r>
-        <w:t xml:space="preserve"> calculat</w:t>
-      </w:r>
-      <w:r>
-        <w:t>o</w:t>
-      </w:r>
-      <w:r>
-        <w:t>r remove the dropdown menu and make the grade input should be get as text and user can only use upper case letters if user entered a lowercase letter change it into uppercase and credit input must be an integer</w:t>
+        <w:t>Sub group 03</w:t>
+      </w:r>
+    </w:p>
+    <w:p>
+      <w:r>
+        <w:t xml:space="preserve">Make the GPA calculator button functional by updating main.html, script.js and style.css, the user should be able to type the course credits, type grades after clicking the Calculate button the system should process and display overall GPA </w:t>
+      </w:r>
+    </w:p>
+    <w:p>
+      <w:r>
+        <w:t>in GPA calculator remove the dropdown menu and make the grade input should be get as text and user can only use upper case letters if user entered a lowercase letter change it into uppercase and credit input must be an integer</w:t>
       </w:r>
     </w:p>
     <w:p>
@@ -596,7 +532,7 @@
           <w:sz w:val="32"/>
           <w:szCs w:val="32"/>
         </w:rPr>
-        <w:t>Screenshots</w:t>
+        <w:br w:type="page"/>
       </w:r>
     </w:p>
     <w:p>
@@ -615,16 +551,8 @@
           <w:sz w:val="32"/>
           <w:szCs w:val="32"/>
         </w:rPr>
-        <w:t>Summary</w:t>
-      </w:r>
-    </w:p>
-    <w:p>
-      <w:r>
-        <w:t xml:space="preserve">We first formed three subgroups and shared the tasks among them. Then the first group created a branch for today's task as "student-toolkit-website". they also created the structure for the website including navigation bar and side bar. then the branch was merged into the main repository. and then the second group reopened the same branch and edited the main file and added the study timer feature. they also merged it with the </w:t>
-      </w:r>
-      <w:r>
         <w:lastRenderedPageBreak/>
-        <w:t>main repository and then the third group reopened the branch and edited the GPA editor. they also improved the UI in a simple and modern manner.</w:t>
+        <w:t>Screenshots</w:t>
       </w:r>
     </w:p>
     <w:p>
@@ -636,28 +564,115 @@
           <w:szCs w:val="32"/>
         </w:rPr>
       </w:pPr>
-    </w:p>
-    <w:p>
-      <w:pPr>
+      <w:r>
         <w:rPr>
           <w:b/>
           <w:bCs/>
           <w:sz w:val="32"/>
           <w:szCs w:val="32"/>
         </w:rPr>
-      </w:pPr>
-      <w:r>
+        <w:drawing>
+          <wp:inline distT="0" distB="0" distL="0" distR="0" wp14:anchorId="264B6E95" wp14:editId="667CA338">
+            <wp:extent cx="5943600" cy="3211830"/>
+            <wp:effectExtent l="0" t="0" r="0" b="7620"/>
+            <wp:docPr id="1" name="Picture 1"/>
+            <wp:cNvGraphicFramePr>
+              <a:graphicFrameLocks xmlns:a="http://schemas.openxmlformats.org/drawingml/2006/main" noChangeAspect="1"/>
+            </wp:cNvGraphicFramePr>
+            <a:graphic xmlns:a="http://schemas.openxmlformats.org/drawingml/2006/main">
+              <a:graphicData uri="http://schemas.openxmlformats.org/drawingml/2006/picture">
+                <pic:pic xmlns:pic="http://schemas.openxmlformats.org/drawingml/2006/picture">
+                  <pic:nvPicPr>
+                    <pic:cNvPr id="1" name=""/>
+                    <pic:cNvPicPr/>
+                  </pic:nvPicPr>
+                  <pic:blipFill>
+                    <a:blip r:embed="rId6"/>
+                    <a:stretch>
+                      <a:fillRect/>
+                    </a:stretch>
+                  </pic:blipFill>
+                  <pic:spPr>
+                    <a:xfrm>
+                      <a:off x="0" y="0"/>
+                      <a:ext cx="5943600" cy="3211830"/>
+                    </a:xfrm>
+                    <a:prstGeom prst="rect">
+                      <a:avLst/>
+                    </a:prstGeom>
+                  </pic:spPr>
+                </pic:pic>
+              </a:graphicData>
+            </a:graphic>
+          </wp:inline>
+        </w:drawing>
+      </w:r>
+    </w:p>
+    <w:p>
+      <w:pPr>
         <w:rPr>
           <w:b/>
           <w:bCs/>
           <w:sz w:val="32"/>
           <w:szCs w:val="32"/>
         </w:rPr>
+      </w:pPr>
+    </w:p>
+    <w:p>
+      <w:pPr>
+        <w:rPr>
+          <w:b/>
+          <w:bCs/>
+          <w:sz w:val="32"/>
+          <w:szCs w:val="32"/>
+        </w:rPr>
+      </w:pPr>
+      <w:r>
+        <w:rPr>
+          <w:b/>
+          <w:bCs/>
+          <w:sz w:val="32"/>
+          <w:szCs w:val="32"/>
+        </w:rPr>
+        <w:t>Summary</w:t>
+      </w:r>
+    </w:p>
+    <w:p>
+      <w:r>
+        <w:t>We first formed three subgroups and shared the tasks among them. Then the first group created a branch for today's task as "student-toolkit-website". they also created the structure for the website including navigation bar and side bar. then the branch was merged into the main repository. and then the second group reopened the same branch and edited the main file and added the study timer feature. they also merged it with the main repository and then the third group reopened the branch and edited the GPA editor. they also improved the UI in a simple and modern manner.</w:t>
+      </w:r>
+    </w:p>
+    <w:p>
+      <w:pPr>
+        <w:rPr>
+          <w:b/>
+          <w:bCs/>
+          <w:sz w:val="32"/>
+          <w:szCs w:val="32"/>
+        </w:rPr>
+      </w:pPr>
+    </w:p>
+    <w:p>
+      <w:pPr>
+        <w:rPr>
+          <w:b/>
+          <w:bCs/>
+          <w:sz w:val="32"/>
+          <w:szCs w:val="32"/>
+        </w:rPr>
+      </w:pPr>
+      <w:r>
+        <w:rPr>
+          <w:b/>
+          <w:bCs/>
+          <w:sz w:val="32"/>
+          <w:szCs w:val="32"/>
+        </w:rPr>
         <w:t>Git Hub Link</w:t>
       </w:r>
     </w:p>
     <w:p>
-      <w:hyperlink r:id="rId6" w:history="1">
+      <w:hyperlink r:id="rId7" w:history="1">
         <w:r>
           <w:rPr>
             <w:rStyle w:val="Hyperlink"/>
@@ -699,7 +714,11 @@
     </w:p>
     <w:p>
       <w:r>
-        <w:t>It was actually pretty easy to use AI tools for the vibe coding session since no prior coding knowledge in required. From our perspective, it felt like having an extra helper while coding. Instead of spending time searching for solutions, we could quickly get suggestions and continue working. This helped our group work more smoothly and focus on building the project together.</w:t>
+        <w:t xml:space="preserve">It was actually pretty easy to use AI tools for the vibe coding session since no prior coding knowledge in required. From our perspective, it felt like having an extra helper while coding. </w:t>
+      </w:r>
+      <w:r>
+        <w:lastRenderedPageBreak/>
+        <w:t>Instead of spending time searching for solutions, we could quickly get suggestions and continue working. This helped our group work more smoothly and focus on building the project together.</w:t>
       </w:r>
     </w:p>
     <w:sectPr>
@@ -713,7 +732,7 @@
 </file>
 
 <file path=word/numbering.xml><?xml version="1.0" encoding="utf-8"?>
-<w:numbering xmlns:wpc="http://schemas.microsoft.com/office/word/2010/wordprocessingCanvas" xmlns:cx="http://schemas.microsoft.com/office/drawing/2014/chartex" xmlns:cx1="http://schemas.microsoft.com/office/drawing/2015/9/8/chartex" xmlns:cx2="http://schemas.microsoft.com/office/drawing/2015/10/21/chartex" xmlns:cx3="http://schemas.microsoft.com/office/drawing/2016/5/9/chartex" xmlns:cx4="http://schemas.microsoft.com/office/drawing/2016/5/10/chartex" xmlns:cx5="http://schemas.microsoft.com/office/drawing/2016/5/11/chartex" xmlns:cx6="http://schemas.microsoft.com/office/drawing/2016/5/12/chartex" xmlns:cx7="http://schemas.microsoft.com/office/drawing/2016/5/13/chartex" xmlns:cx8="http://schemas.microsoft.com/office/drawing/2016/5/14/chartex" xmlns:mc="http://schemas.openxmlformats.org/markup-compatibility/2006" xmlns:aink="http://schemas.microsoft.com/office/drawing/2016/ink" xmlns:am3d="http://schemas.microsoft.com/office/drawing/2017/model3d" xmlns:o="urn:schemas-microsoft-com:office:office" xmlns:oel="http://schemas.microsoft.com/office/2019/extlst" xmlns:r="http://schemas.openxmlformats.org/officeDocument/2006/relationships" xmlns:m="http://schemas.openxmlformats.org/officeDocument/2006/math" xmlns:v="urn:schemas-microsoft-com:vml" xmlns:wp14="http://schemas.microsoft.com/office/word/2010/wordprocessingDrawing" xmlns:wp="http://schemas.openxmlformats.org/drawingml/2006/wordprocessingDrawing" xmlns:w10="urn:schemas-microsoft-com:office:word" xmlns:w="http://schemas.openxmlformats.org/wordprocessingml/2006/main" xmlns:w14="http://schemas.microsoft.com/office/word/2010/wordml" xmlns:w15="http://schemas.microsoft.com/office/word/2012/wordml" xmlns:w16cex="http://schemas.microsoft.com/office/word/2018/wordml/cex" xmlns:w16cid="http://schemas.microsoft.com/office/word/2016/wordml/cid" xmlns:w16="http://schemas.microsoft.com/office/word/2018/wordml" xmlns:w16du="http://schemas.microsoft.com/office/word/2023/wordml/word16du" xmlns:w16sdtdh="http://schemas.microsoft.com/office/word/2020/wordml/sdtdatahash" xmlns:w16sdtfl="http://schemas.microsoft.com/office/word/2024/wordml/sdtformatlock" xmlns:w16se="http://schemas.microsoft.com/office/word/2015/wordml/symex" xmlns:wpg="http://schemas.microsoft.com/office/word/2010/wordprocessingGroup" xmlns:wpi="http://schemas.microsoft.com/office/word/2010/wordprocessingInk" xmlns:wne="http://schemas.microsoft.com/office/word/2006/wordml" xmlns:wps="http://schemas.microsoft.com/office/word/2010/wordprocessingShape" mc:Ignorable="w14 w15 w16se w16cid w16 w16cex w16sdtdh w16sdtfl w16du wp14">
+<w:numbering xmlns:wpc="http://schemas.microsoft.com/office/word/2010/wordprocessingCanvas" xmlns:cx="http://schemas.microsoft.com/office/drawing/2014/chartex" xmlns:cx1="http://schemas.microsoft.com/office/drawing/2015/9/8/chartex" xmlns:cx2="http://schemas.microsoft.com/office/drawing/2015/10/21/chartex" xmlns:cx3="http://schemas.microsoft.com/office/drawing/2016/5/9/chartex" xmlns:cx4="http://schemas.microsoft.com/office/drawing/2016/5/10/chartex" xmlns:cx5="http://schemas.microsoft.com/office/drawing/2016/5/11/chartex" xmlns:cx6="http://schemas.microsoft.com/office/drawing/2016/5/12/chartex" xmlns:cx7="http://schemas.microsoft.com/office/drawing/2016/5/13/chartex" xmlns:cx8="http://schemas.microsoft.com/office/drawing/2016/5/14/chartex" xmlns:mc="http://schemas.openxmlformats.org/markup-compatibility/2006" xmlns:aink="http://schemas.microsoft.com/office/drawing/2016/ink" xmlns:am3d="http://schemas.microsoft.com/office/drawing/2017/model3d" xmlns:o="urn:schemas-microsoft-com:office:office" xmlns:oel="http://schemas.microsoft.com/office/2019/extlst" xmlns:r="http://schemas.openxmlformats.org/officeDocument/2006/relationships" xmlns:m="http://schemas.openxmlformats.org/officeDocument/2006/math" xmlns:v="urn:schemas-microsoft-com:vml" xmlns:wp14="http://schemas.microsoft.com/office/word/2010/wordprocessingDrawing" xmlns:wp="http://schemas.openxmlformats.org/drawingml/2006/wordprocessingDrawing" xmlns:w10="urn:schemas-microsoft-com:office:word" xmlns:w="http://schemas.openxmlformats.org/wordprocessingml/2006/main" xmlns:w14="http://schemas.microsoft.com/office/word/2010/wordml" xmlns:w15="http://schemas.microsoft.com/office/word/2012/wordml" xmlns:w16cex="http://schemas.microsoft.com/office/word/2018/wordml/cex" xmlns:w16cid="http://schemas.microsoft.com/office/word/2016/wordml/cid" xmlns:w16="http://schemas.microsoft.com/office/word/2018/wordml" xmlns:w16sdtdh="http://schemas.microsoft.com/office/word/2020/wordml/sdtdatahash" xmlns:w16se="http://schemas.microsoft.com/office/word/2015/wordml/symex" xmlns:wpg="http://schemas.microsoft.com/office/word/2010/wordprocessingGroup" xmlns:wpi="http://schemas.microsoft.com/office/word/2010/wordprocessingInk" xmlns:wne="http://schemas.microsoft.com/office/word/2006/wordml" xmlns:wps="http://schemas.microsoft.com/office/word/2010/wordprocessingShape" mc:Ignorable="w14 w15 w16se w16cid w16 w16cex w16sdtdh wp14">
   <w:abstractNum w:abstractNumId="0" w15:restartNumberingAfterBreak="0">
     <w:nsid w:val="1CBC02C7"/>
     <w:multiLevelType w:val="hybridMultilevel"/>
@@ -834,7 +853,7 @@
 </file>
 
 <file path=word/styles.xml><?xml version="1.0" encoding="utf-8"?>
-<w:styles xmlns:mc="http://schemas.openxmlformats.org/markup-compatibility/2006" xmlns:r="http://schemas.openxmlformats.org/officeDocument/2006/relationships" xmlns:w="http://schemas.openxmlformats.org/wordprocessingml/2006/main" xmlns:w14="http://schemas.microsoft.com/office/word/2010/wordml" xmlns:w15="http://schemas.microsoft.com/office/word/2012/wordml" xmlns:w16cex="http://schemas.microsoft.com/office/word/2018/wordml/cex" xmlns:w16cid="http://schemas.microsoft.com/office/word/2016/wordml/cid" xmlns:w16="http://schemas.microsoft.com/office/word/2018/wordml" xmlns:w16du="http://schemas.microsoft.com/office/word/2023/wordml/word16du" xmlns:w16sdtdh="http://schemas.microsoft.com/office/word/2020/wordml/sdtdatahash" xmlns:w16sdtfl="http://schemas.microsoft.com/office/word/2024/wordml/sdtformatlock" xmlns:w16se="http://schemas.microsoft.com/office/word/2015/wordml/symex" mc:Ignorable="w14 w15 w16se w16cid w16 w16cex w16sdtdh w16sdtfl w16du">
+<w:styles xmlns:mc="http://schemas.openxmlformats.org/markup-compatibility/2006" xmlns:r="http://schemas.openxmlformats.org/officeDocument/2006/relationships" xmlns:w="http://schemas.openxmlformats.org/wordprocessingml/2006/main" xmlns:w14="http://schemas.microsoft.com/office/word/2010/wordml" xmlns:w15="http://schemas.microsoft.com/office/word/2012/wordml" xmlns:w16cex="http://schemas.microsoft.com/office/word/2018/wordml/cex" xmlns:w16cid="http://schemas.microsoft.com/office/word/2016/wordml/cid" xmlns:w16="http://schemas.microsoft.com/office/word/2018/wordml" xmlns:w16sdtdh="http://schemas.microsoft.com/office/word/2020/wordml/sdtdatahash" xmlns:w16se="http://schemas.microsoft.com/office/word/2015/wordml/symex" mc:Ignorable="w14 w15 w16se w16cid w16 w16cex w16sdtdh">
   <w:docDefaults>
     <w:rPrDefault>
       <w:rPr>

</xml_diff>